<commit_message>
Document the weekly goal report in the handover documents and SOPs.
Co-authored-by: Cursor <cursoragent@cursor.com>
</commit_message>
<xml_diff>
--- a/docs/handover/word/01 - Start Here and System Overview.docx
+++ b/docs/handover/word/01 - Start Here and System Overview.docx
@@ -1951,11 +1951,43 @@
           </w:p>
         </w:tc>
       </w:tr>
+      <w:tr>
+        <w:tc>
+          <w:tcPr>
+            <w:tcW w:type="dxa" w:w="3312"/>
+          </w:tcPr>
+          <w:p>
+            <w:r>
+              <w:t>Weekly goal report (weekly_goal_report.py)</w:t>
+            </w:r>
+          </w:p>
+        </w:tc>
+        <w:tc>
+          <w:tcPr>
+            <w:tcW w:type="dxa" w:w="3312"/>
+          </w:tcPr>
+          <w:p>
+            <w:r>
+              <w:t>Monday 10:30 IST (server cron)</w:t>
+            </w:r>
+          </w:p>
+        </w:tc>
+        <w:tc>
+          <w:tcPr>
+            <w:tcW w:type="dxa" w:w="3312"/>
+          </w:tcPr>
+          <w:p>
+            <w:r>
+              <w:t>Last week's (Mon-Sun) agents of teams A and B who missed their weekly goal. Admin and Project Manager get all agents; each Assistant Manager / Team Lead gets only their own agents. If nobody missed, an 'all achieved' email is sent instead (rules: 03, Business rules).</w:t>
+            </w:r>
+          </w:p>
+        </w:tc>
+      </w:tr>
     </w:tbl>
     <w:p/>
     <w:p>
       <w:r>
-        <w:t>Recipients for the three report emails are managed by Super Admin in Report emails (table report_email_recipient). Check the real schedule on the server with crontab -l.</w:t>
+        <w:t>Recipients for the billable and the two tracker report emails are managed by Super Admin in Report emails (table report_email_recipient). The weekly goal report has no recipient list: it goes to active users by role and reporting line. Check the real schedule on the server with crontab -l.</w:t>
       </w:r>
     </w:p>
     <w:p>

</xml_diff>

<commit_message>
Docs: Assistant Team Leader QC access and Analytics Audit Report in role access, workflow and handover docs
Co-authored-by: Cursor <cursoragent@cursor.com>
</commit_message>
<xml_diff>
--- a/docs/handover/word/01 - Start Here and System Overview.docx
+++ b/docs/handover/word/01 - Start Here and System Overview.docx
@@ -1004,7 +1004,7 @@
           </w:tcPr>
           <w:p>
             <w:r>
-              <w:t>Own team, view only except the roster (submits changes). Also does QC like a QA on agents where they are the QA (QC forms, My Report hours, audit results).</w:t>
+              <w:t>Own team, view only except the roster (submits changes). Also does QC like a QA on agents where they are the QA (QC forms, My Report hours, Analytics &gt; Audit Report with own audits).</w:t>
             </w:r>
           </w:p>
         </w:tc>
@@ -1036,7 +1036,7 @@
           </w:tcPr>
           <w:p>
             <w:r>
-              <w:t>Agents assigned to them (qa_id): Agent Files &amp; QC, My Report hours, audit results.</w:t>
+              <w:t>Agents assigned to them (qa_id): Agent Files &amp; QC, My Report hours, Analytics &gt; Audit Report (own audits).</w:t>
             </w:r>
           </w:p>
         </w:tc>

</xml_diff>

<commit_message>
View-only Projects tab for Agent, QA and Assistant Team Leader: POST /project/my_projects; docs
Co-authored-by: Cursor <cursoragent@cursor.com>
</commit_message>
<xml_diff>
--- a/docs/handover/word/01 - Start Here and System Overview.docx
+++ b/docs/handover/word/01 - Start Here and System Overview.docx
@@ -1077,6 +1077,11 @@
     <w:p/>
     <w:p>
       <w:r>
+        <w:t>Agents, QA and Assistant Team Leaders also have a view-only Projects tab (their projects with files, SOP links and tasks with sample files; POST /project/my_projects).</w:t>
+      </w:r>
+    </w:p>
+    <w:p>
+      <w:r>
         <w:t>Each user has a role plus reporting lines (project manager, assistant manager, team leader, QA). Visibility in every report follows these lines. The columns that hold them are in 03, Database reference.</w:t>
       </w:r>
     </w:p>

</xml_diff>